<commit_message>
LMS-28 Update final documentation
</commit_message>
<xml_diff>
--- a/Documentation/Library_Management_System_Final_Documentation.docx
+++ b/Documentation/Library_Management_System_Final_Documentation.docx
@@ -6756,26 +6756,9 @@
     <w:p>
       <w:pPr>
         <w:bidi/>
-        <w:spacing w:before="160" w:after="100"/>
-        <w:jc w:val="right"/>
-      </w:pPr>
-      <w:r>
-        <w:rPr>
-          <w:b/>
-          <w:sz w:val="32"/>
-        </w:rPr>
-        <w:t>الخاتمة</w:t>
-      </w:r>
-    </w:p>
-    <w:p>
-      <w:pPr>
-        <w:bidi/>
         <w:spacing w:after="80" w:line="288" w:lineRule="auto"/>
         <w:jc w:val="right"/>
       </w:pPr>
-      <w:r>
-        <w:t>النتيجة النهائية هي توثيق متكامل ومتسق يمكن استخدامه في التسليم والمناقشة، مع إبقاء التركيز على متطلبات المقرر فقط.</w:t>
-      </w:r>
     </w:p>
     <w:sectPr>
       <w:footerReference w:type="default" r:id="rId28"/>

</xml_diff>